<commit_message>
Refactor NHANES figures to single source
</commit_message>
<xml_diff>
--- a/examples/nhanes-undiagnosed-diabetes/submission_package/manuscript_final_with_tables_figures.docx
+++ b/examples/nhanes-undiagnosed-diabetes/submission_package/manuscript_final_with_tables_figures.docx
@@ -92,6 +92,26 @@
           <w:sz w:val="20"/>
         </w:rPr>
         <w:t>Conflicts of interest: [To be completed; state none if applicable]</w:t>
+      </w:r>
+    </w:p>
+    <w:p>
+      <w:r>
+        <w:rPr>
+          <w:rFonts w:ascii="Times New Roman" w:hAnsi="Times New Roman"/>
+          <w:b w:val="0"/>
+          <w:sz w:val="20"/>
+        </w:rPr>
+        <w:t>Author contributions: [To be completed]</w:t>
+      </w:r>
+    </w:p>
+    <w:p>
+      <w:r>
+        <w:rPr>
+          <w:rFonts w:ascii="Times New Roman" w:hAnsi="Times New Roman"/>
+          <w:b w:val="0"/>
+          <w:sz w:val="20"/>
+        </w:rPr>
+        <w:t>Acknowledgements: [To be completed]</w:t>
       </w:r>
     </w:p>
     <w:p>

</xml_diff>